<commit_message>
- add tabbed-nav component
</commit_message>
<xml_diff>
--- a/demo/modules/module_01/mod_01_03_lemons.docx
+++ b/demo/modules/module_01/mod_01_03_lemons.docx
@@ -2,6 +2,31 @@
 <file path=word/document.xml><?xml version="1.0" encoding="utf-8"?>
 <w:document xmlns:o="urn:schemas-microsoft-com:office:office" xmlns:r="http://schemas.openxmlformats.org/officeDocument/2006/relationships" xmlns:v="urn:schemas-microsoft-com:vml" xmlns:w="http://schemas.openxmlformats.org/wordprocessingml/2006/main" xmlns:w10="urn:schemas-microsoft-com:office:word" xmlns:wp="http://schemas.openxmlformats.org/drawingml/2006/wordprocessingDrawing" xmlns:wps="http://schemas.microsoft.com/office/word/2010/wordprocessingShape" xmlns:wpg="http://schemas.microsoft.com/office/word/2010/wordprocessingGroup" xmlns:mc="http://schemas.openxmlformats.org/markup-compatibility/2006" xmlns:wp14="http://schemas.microsoft.com/office/word/2010/wordprocessingDrawing" xmlns:w14="http://schemas.microsoft.com/office/word/2010/wordml" xmlns:w15="http://schemas.microsoft.com/office/word/2012/wordml" mc:Ignorable="w14 wp14 w15">
   <w:body>
+    <w:p>
+      <w:pPr>
+        <w:pStyle w:val="Normal"/>
+        <w:numPr>
+          <w:ilvl w:val="0"/>
+          <w:numId w:val="2"/>
+        </w:numPr>
+        <w:bidi w:val="0"/>
+        <w:spacing w:before="113" w:after="113"/>
+        <w:ind w:hanging="0" w:left="0"/>
+        <w:jc w:val="left"/>
+        <w:rPr>
+          <w:i w:val="false"/>
+          <w:i w:val="false"/>
+          <w:iCs w:val="false"/>
+        </w:rPr>
+      </w:pPr>
+      <w:r>
+        <w:rPr>
+          <w:i w:val="false"/>
+          <w:iCs w:val="false"/>
+        </w:rPr>
+        <w:t>`=[[component.module-navigation]]`</w:t>
+      </w:r>
+    </w:p>
     <w:p>
       <w:pPr>
         <w:pStyle w:val="Heading1"/>
@@ -11,6 +36,7 @@
         </w:numPr>
         <w:bidi w:val="0"/>
         <w:spacing w:before="240" w:after="120"/>
+        <w:ind w:hanging="0" w:left="0" w:right="0"/>
         <w:jc w:val="left"/>
         <w:rPr/>
       </w:pPr>
@@ -21,7 +47,7 @@
     </w:p>
     <w:p>
       <w:pPr>
-        <w:pStyle w:val="TextBody"/>
+        <w:pStyle w:val="BodyText"/>
         <w:bidi w:val="0"/>
         <w:spacing w:before="240" w:after="120"/>
         <w:jc w:val="left"/>
@@ -87,6 +113,7 @@
           <w:numId w:val="2"/>
         </w:numPr>
         <w:bidi w:val="0"/>
+        <w:ind w:hanging="0" w:left="0" w:right="0"/>
         <w:jc w:val="left"/>
         <w:rPr/>
       </w:pPr>
@@ -495,7 +522,7 @@
       <w:suppressAutoHyphens w:val="true"/>
       <w:bidi w:val="0"/>
       <w:spacing w:before="113" w:after="113"/>
-      <w:ind w:left="0" w:right="0" w:hanging="0"/>
+      <w:ind w:hanging="0" w:left="0" w:right="0"/>
       <w:jc w:val="left"/>
     </w:pPr>
     <w:rPr>
@@ -510,7 +537,7 @@
   <w:style w:type="paragraph" w:styleId="Heading1">
     <w:name w:val="Heading 1"/>
     <w:basedOn w:val="Heading"/>
-    <w:next w:val="TextBody"/>
+    <w:next w:val="BodyText"/>
     <w:qFormat/>
     <w:pPr>
       <w:numPr>
@@ -530,7 +557,7 @@
   <w:style w:type="paragraph" w:styleId="Heading2">
     <w:name w:val="Heading 2"/>
     <w:basedOn w:val="Heading"/>
-    <w:next w:val="TextBody"/>
+    <w:next w:val="BodyText"/>
     <w:qFormat/>
     <w:pPr>
       <w:numPr>
@@ -550,7 +577,7 @@
   <w:style w:type="paragraph" w:styleId="Heading">
     <w:name w:val="Heading"/>
     <w:basedOn w:val="Normal"/>
-    <w:next w:val="TextBody"/>
+    <w:next w:val="BodyText"/>
     <w:qFormat/>
     <w:pPr>
       <w:keepNext w:val="true"/>
@@ -562,7 +589,7 @@
       <w:szCs w:val="28"/>
     </w:rPr>
   </w:style>
-  <w:style w:type="paragraph" w:styleId="TextBody">
+  <w:style w:type="paragraph" w:styleId="BodyText">
     <w:name w:val="Body Text"/>
     <w:basedOn w:val="Normal"/>
     <w:pPr>
@@ -572,7 +599,7 @@
   </w:style>
   <w:style w:type="paragraph" w:styleId="List">
     <w:name w:val="List"/>
-    <w:basedOn w:val="TextBody"/>
+    <w:basedOn w:val="BodyText"/>
     <w:pPr/>
     <w:rPr>
       <w:rFonts w:cs="Lohit Devanagari"/>
@@ -606,4 +633,110 @@
     </w:rPr>
   </w:style>
 </w:styles>
+</file>
+
+<file path=word/theme/theme1.xml><?xml version="1.0" encoding="utf-8"?>
+<a:theme xmlns:a="http://schemas.openxmlformats.org/drawingml/2006/main" xmlns:r="http://schemas.openxmlformats.org/officeDocument/2006/relationships" name="Office">
+  <a:themeElements>
+    <a:clrScheme name="LibreOffice">
+      <a:dk1>
+        <a:srgbClr val="000000"/>
+      </a:dk1>
+      <a:lt1>
+        <a:srgbClr val="ffffff"/>
+      </a:lt1>
+      <a:dk2>
+        <a:srgbClr val="000000"/>
+      </a:dk2>
+      <a:lt2>
+        <a:srgbClr val="ffffff"/>
+      </a:lt2>
+      <a:accent1>
+        <a:srgbClr val="18a303"/>
+      </a:accent1>
+      <a:accent2>
+        <a:srgbClr val="0369a3"/>
+      </a:accent2>
+      <a:accent3>
+        <a:srgbClr val="a33e03"/>
+      </a:accent3>
+      <a:accent4>
+        <a:srgbClr val="8e03a3"/>
+      </a:accent4>
+      <a:accent5>
+        <a:srgbClr val="c99c00"/>
+      </a:accent5>
+      <a:accent6>
+        <a:srgbClr val="c9211e"/>
+      </a:accent6>
+      <a:hlink>
+        <a:srgbClr val="0000ee"/>
+      </a:hlink>
+      <a:folHlink>
+        <a:srgbClr val="551a8b"/>
+      </a:folHlink>
+    </a:clrScheme>
+    <a:fontScheme name="Office">
+      <a:majorFont>
+        <a:latin typeface="Arial" pitchFamily="0" charset="1"/>
+        <a:ea typeface="DejaVu Sans" pitchFamily="0" charset="1"/>
+        <a:cs typeface="DejaVu Sans" pitchFamily="0" charset="1"/>
+      </a:majorFont>
+      <a:minorFont>
+        <a:latin typeface="Arial" pitchFamily="0" charset="1"/>
+        <a:ea typeface="DejaVu Sans" pitchFamily="0" charset="1"/>
+        <a:cs typeface="DejaVu Sans" pitchFamily="0" charset="1"/>
+      </a:minorFont>
+    </a:fontScheme>
+    <a:fmtScheme>
+      <a:fillStyleLst>
+        <a:solidFill>
+          <a:schemeClr val="phClr"/>
+        </a:solidFill>
+        <a:solidFill>
+          <a:schemeClr val="phClr"/>
+        </a:solidFill>
+        <a:solidFill>
+          <a:schemeClr val="phClr"/>
+        </a:solidFill>
+      </a:fillStyleLst>
+      <a:lnStyleLst>
+        <a:ln w="6350" cap="flat" cmpd="sng" algn="ctr">
+          <a:prstDash val="solid"/>
+          <a:miter/>
+        </a:ln>
+        <a:ln w="6350" cap="flat" cmpd="sng" algn="ctr">
+          <a:prstDash val="solid"/>
+          <a:miter/>
+        </a:ln>
+        <a:ln w="6350" cap="flat" cmpd="sng" algn="ctr">
+          <a:prstDash val="solid"/>
+          <a:miter/>
+        </a:ln>
+      </a:lnStyleLst>
+      <a:effectStyleLst>
+        <a:effectStyle>
+          <a:effectLst/>
+        </a:effectStyle>
+        <a:effectStyle>
+          <a:effectLst/>
+        </a:effectStyle>
+        <a:effectStyle>
+          <a:effectLst/>
+        </a:effectStyle>
+      </a:effectStyleLst>
+      <a:bgFillStyleLst>
+        <a:solidFill>
+          <a:schemeClr val="phClr"/>
+        </a:solidFill>
+        <a:solidFill>
+          <a:schemeClr val="phClr"/>
+        </a:solidFill>
+        <a:solidFill>
+          <a:schemeClr val="phClr"/>
+        </a:solidFill>
+      </a:bgFillStyleLst>
+    </a:fmtScheme>
+  </a:themeElements>
+</a:theme>
 </file>
</xml_diff>

<commit_message>
- amend broken image paths in demo content
</commit_message>
<xml_diff>
--- a/demo/modules/module_01/mod_01_03_lemons.docx
+++ b/demo/modules/module_01/mod_01_03_lemons.docx
@@ -7,11 +7,11 @@
         <w:pStyle w:val="Normal"/>
         <w:numPr>
           <w:ilvl w:val="0"/>
-          <w:numId w:val="2"/>
+          <w:numId w:val="1"/>
         </w:numPr>
         <w:bidi w:val="0"/>
         <w:spacing w:before="113" w:after="113"/>
-        <w:ind w:hanging="0" w:left="0"/>
+        <w:ind w:hanging="0" w:left="0" w:right="0"/>
         <w:jc w:val="left"/>
         <w:rPr>
           <w:i w:val="false"/>
@@ -32,7 +32,7 @@
         <w:pStyle w:val="Heading1"/>
         <w:numPr>
           <w:ilvl w:val="0"/>
-          <w:numId w:val="2"/>
+          <w:numId w:val="1"/>
         </w:numPr>
         <w:bidi w:val="0"/>
         <w:spacing w:before="240" w:after="120"/>
@@ -73,7 +73,7 @@
                     </pic:cNvPicPr>
                   </pic:nvPicPr>
                   <pic:blipFill>
-                    <a:blip r:embed="rId2"/>
+                    <a:blip r:link="rId2"/>
                     <a:stretch>
                       <a:fillRect/>
                     </a:stretch>
@@ -110,7 +110,7 @@
         <w:pStyle w:val="Heading2"/>
         <w:numPr>
           <w:ilvl w:val="1"/>
-          <w:numId w:val="2"/>
+          <w:numId w:val="1"/>
         </w:numPr>
         <w:bidi w:val="0"/>
         <w:ind w:hanging="0" w:left="0" w:right="0"/>
@@ -253,6 +253,7 @@
         </w:tabs>
         <w:ind w:left="0" w:hanging="0"/>
       </w:pPr>
+      <w:rPr/>
     </w:lvl>
     <w:lvl w:ilvl="1">
       <w:start w:val="1"/>
@@ -266,6 +267,7 @@
         </w:tabs>
         <w:ind w:left="0" w:hanging="0"/>
       </w:pPr>
+      <w:rPr/>
     </w:lvl>
     <w:lvl w:ilvl="2">
       <w:start w:val="1"/>
@@ -279,6 +281,7 @@
         </w:tabs>
         <w:ind w:left="0" w:hanging="0"/>
       </w:pPr>
+      <w:rPr/>
     </w:lvl>
     <w:lvl w:ilvl="3">
       <w:start w:val="1"/>
@@ -292,6 +295,7 @@
         </w:tabs>
         <w:ind w:left="0" w:hanging="0"/>
       </w:pPr>
+      <w:rPr/>
     </w:lvl>
     <w:lvl w:ilvl="4">
       <w:start w:val="1"/>
@@ -305,6 +309,7 @@
         </w:tabs>
         <w:ind w:left="0" w:hanging="0"/>
       </w:pPr>
+      <w:rPr/>
     </w:lvl>
     <w:lvl w:ilvl="5">
       <w:start w:val="1"/>
@@ -318,6 +323,7 @@
         </w:tabs>
         <w:ind w:left="0" w:hanging="0"/>
       </w:pPr>
+      <w:rPr/>
     </w:lvl>
     <w:lvl w:ilvl="6">
       <w:start w:val="1"/>
@@ -331,6 +337,7 @@
         </w:tabs>
         <w:ind w:left="0" w:hanging="0"/>
       </w:pPr>
+      <w:rPr/>
     </w:lvl>
     <w:lvl w:ilvl="7">
       <w:start w:val="1"/>
@@ -344,6 +351,7 @@
         </w:tabs>
         <w:ind w:left="0" w:hanging="0"/>
       </w:pPr>
+      <w:rPr/>
     </w:lvl>
     <w:lvl w:ilvl="8">
       <w:start w:val="1"/>
@@ -357,6 +365,7 @@
         </w:tabs>
         <w:ind w:left="0" w:hanging="0"/>
       </w:pPr>
+      <w:rPr/>
     </w:lvl>
   </w:abstractNum>
   <w:abstractNum w:abstractNumId="2">
@@ -372,7 +381,6 @@
         </w:tabs>
         <w:ind w:left="0" w:hanging="0"/>
       </w:pPr>
-      <w:rPr/>
     </w:lvl>
     <w:lvl w:ilvl="1">
       <w:start w:val="1"/>
@@ -386,7 +394,6 @@
         </w:tabs>
         <w:ind w:left="0" w:hanging="0"/>
       </w:pPr>
-      <w:rPr/>
     </w:lvl>
     <w:lvl w:ilvl="2">
       <w:start w:val="1"/>
@@ -400,7 +407,6 @@
         </w:tabs>
         <w:ind w:left="0" w:hanging="0"/>
       </w:pPr>
-      <w:rPr/>
     </w:lvl>
     <w:lvl w:ilvl="3">
       <w:start w:val="1"/>
@@ -414,7 +420,6 @@
         </w:tabs>
         <w:ind w:left="0" w:hanging="0"/>
       </w:pPr>
-      <w:rPr/>
     </w:lvl>
     <w:lvl w:ilvl="4">
       <w:start w:val="1"/>
@@ -428,7 +433,6 @@
         </w:tabs>
         <w:ind w:left="0" w:hanging="0"/>
       </w:pPr>
-      <w:rPr/>
     </w:lvl>
     <w:lvl w:ilvl="5">
       <w:start w:val="1"/>
@@ -442,7 +446,6 @@
         </w:tabs>
         <w:ind w:left="0" w:hanging="0"/>
       </w:pPr>
-      <w:rPr/>
     </w:lvl>
     <w:lvl w:ilvl="6">
       <w:start w:val="1"/>
@@ -456,7 +459,6 @@
         </w:tabs>
         <w:ind w:left="0" w:hanging="0"/>
       </w:pPr>
-      <w:rPr/>
     </w:lvl>
     <w:lvl w:ilvl="7">
       <w:start w:val="1"/>
@@ -470,7 +472,6 @@
         </w:tabs>
         <w:ind w:left="0" w:hanging="0"/>
       </w:pPr>
-      <w:rPr/>
     </w:lvl>
     <w:lvl w:ilvl="8">
       <w:start w:val="1"/>
@@ -484,7 +485,6 @@
         </w:tabs>
         <w:ind w:left="0" w:hanging="0"/>
       </w:pPr>
-      <w:rPr/>
     </w:lvl>
   </w:abstractNum>
   <w:num w:numId="1">
@@ -542,7 +542,7 @@
     <w:pPr>
       <w:numPr>
         <w:ilvl w:val="0"/>
-        <w:numId w:val="2"/>
+        <w:numId w:val="1"/>
       </w:numPr>
       <w:spacing w:before="240" w:after="120"/>
       <w:outlineLvl w:val="0"/>
@@ -562,7 +562,7 @@
     <w:pPr>
       <w:numPr>
         <w:ilvl w:val="1"/>
-        <w:numId w:val="2"/>
+        <w:numId w:val="1"/>
       </w:numPr>
       <w:spacing w:before="200" w:after="120"/>
       <w:outlineLvl w:val="1"/>

</xml_diff>